<commit_message>
finish with the report aspect of things. off to final check
</commit_message>
<xml_diff>
--- a/Assignment_2/isa-sim/Assignment_2_Group_17.docx
+++ b/Assignment_2/isa-sim/Assignment_2_Group_17.docx
@@ -4,15 +4,150 @@
   <w:body>
     <w:p>
       <w:pPr>
-        <w:rPr>
-          <w:rFonts w:ascii="Times New Roman" w:hAnsi="Times New Roman" w:cs="Times New Roman"/>
+        <w:pStyle w:val="Title"/>
+        <w:jc w:val="center"/>
+        <w:rPr>
+          <w:rFonts w:ascii="Times New Roman" w:hAnsi="Times New Roman" w:cs="Times New Roman"/>
+          <w:color w:val="000000" w:themeColor="text1"/>
         </w:rPr>
       </w:pPr>
       <w:r>
         <w:rPr>
           <w:rFonts w:ascii="Times New Roman" w:hAnsi="Times New Roman" w:cs="Times New Roman"/>
-        </w:rPr>
-        <w:br/>
+          <w:color w:val="000000" w:themeColor="text1"/>
+        </w:rPr>
+        <w:t>Assignment 2:</w:t>
+      </w:r>
+    </w:p>
+    <w:p>
+      <w:pPr>
+        <w:pStyle w:val="Title"/>
+        <w:jc w:val="center"/>
+        <w:rPr>
+          <w:rFonts w:ascii="Times New Roman" w:hAnsi="Times New Roman" w:cs="Times New Roman"/>
+          <w:color w:val="000000" w:themeColor="text1"/>
+        </w:rPr>
+      </w:pPr>
+      <w:r>
+        <w:rPr>
+          <w:rFonts w:ascii="Times New Roman" w:hAnsi="Times New Roman" w:cs="Times New Roman"/>
+          <w:color w:val="000000" w:themeColor="text1"/>
+        </w:rPr>
+        <w:t>ISA Simulator Implementation</w:t>
+      </w:r>
+    </w:p>
+    <w:p>
+      <w:pPr>
+        <w:pStyle w:val="Subtitle"/>
+        <w:jc w:val="center"/>
+        <w:rPr>
+          <w:rStyle w:val="Strong"/>
+          <w:rFonts w:ascii="Times New Roman" w:hAnsi="Times New Roman" w:cs="Times New Roman"/>
+          <w:b w:val="0"/>
+          <w:bCs w:val="0"/>
+          <w:i w:val="0"/>
+          <w:iCs w:val="0"/>
+        </w:rPr>
+      </w:pPr>
+      <w:r>
+        <w:rPr>
+          <w:rStyle w:val="Strong"/>
+          <w:rFonts w:ascii="Times New Roman" w:hAnsi="Times New Roman" w:cs="Times New Roman"/>
+          <w:b w:val="0"/>
+          <w:bCs w:val="0"/>
+          <w:i w:val="0"/>
+          <w:iCs w:val="0"/>
+        </w:rPr>
+        <w:t>Introduction</w:t>
+      </w:r>
+    </w:p>
+    <w:p>
+      <w:pPr>
+        <w:rPr>
+          <w:rFonts w:ascii="Times New Roman" w:hAnsi="Times New Roman" w:cs="Times New Roman"/>
+        </w:rPr>
+      </w:pPr>
+      <w:r>
+        <w:rPr>
+          <w:rFonts w:ascii="Times New Roman" w:hAnsi="Times New Roman" w:cs="Times New Roman"/>
+        </w:rPr>
+        <w:t>An instruction set architecture</w:t>
+      </w:r>
+      <w:r>
+        <w:rPr>
+          <w:rFonts w:ascii="Times New Roman" w:hAnsi="Times New Roman" w:cs="Times New Roman"/>
+        </w:rPr>
+        <w:t xml:space="preserve"> simulator is a software program that mimics how a real processor executes machine code. Our simulator reads programs written in assembly language and executes them instruction by instruction, keeping track of register values, memory contents, and the number of cycles elapsed. The processor we simulated has 16 registers (R0 to R15) 256 memory locations of data, and 256 memory locations for instructions. Each register and memory location stores an 8-bit unassigned integer, so values range from 0 to 255. Register R0 is special because it always contains 0 and cannot be changed. </w:t>
+      </w:r>
+    </w:p>
+    <w:p>
+      <w:pPr>
+        <w:rPr>
+          <w:rFonts w:ascii="Times New Roman" w:hAnsi="Times New Roman" w:cs="Times New Roman"/>
+        </w:rPr>
+      </w:pPr>
+      <w:r>
+        <w:rPr>
+          <w:rFonts w:ascii="Times New Roman" w:hAnsi="Times New Roman" w:cs="Times New Roman"/>
+        </w:rPr>
+        <w:t>The simulator was implemented in Python using object-oriented programming. Three classes were provided to us: RegisterFile for managing the 16 registers, DataMemory for storing and retrieving data values, and InstructionMemory for holding the program. Our task was to write the main simulation loop that fetched instructions, decodes them, and executes them one cycle at a time.</w:t>
+      </w:r>
+    </w:p>
+    <w:p>
+      <w:pPr>
+        <w:pStyle w:val="Subtitle"/>
+        <w:jc w:val="center"/>
+        <w:rPr>
+          <w:rStyle w:val="Strong"/>
+          <w:rFonts w:ascii="Times New Roman" w:hAnsi="Times New Roman" w:cs="Times New Roman"/>
+          <w:b w:val="0"/>
+          <w:bCs w:val="0"/>
+          <w:i w:val="0"/>
+          <w:iCs w:val="0"/>
+        </w:rPr>
+      </w:pPr>
+      <w:r>
+        <w:rPr>
+          <w:rStyle w:val="Strong"/>
+          <w:rFonts w:ascii="Times New Roman" w:hAnsi="Times New Roman" w:cs="Times New Roman"/>
+          <w:b w:val="0"/>
+          <w:bCs w:val="0"/>
+          <w:i w:val="0"/>
+          <w:iCs w:val="0"/>
+        </w:rPr>
+        <w:t>Architecture Overview</w:t>
+      </w:r>
+    </w:p>
+    <w:p>
+      <w:pPr>
+        <w:rPr>
+          <w:rFonts w:ascii="Times New Roman" w:hAnsi="Times New Roman" w:cs="Times New Roman"/>
+        </w:rPr>
+      </w:pPr>
+      <w:r>
+        <w:rPr>
+          <w:rFonts w:ascii="Times New Roman" w:hAnsi="Times New Roman" w:cs="Times New Roman"/>
+        </w:rPr>
+        <w:t xml:space="preserve">The simulator architecture </w:t>
+      </w:r>
+      <w:r>
+        <w:rPr>
+          <w:rFonts w:ascii="Times New Roman" w:hAnsi="Times New Roman" w:cs="Times New Roman"/>
+        </w:rPr>
+        <w:t xml:space="preserve">follows the classic fetch decode execute cycle that also real processors use. At the start of each cycle, the program counter (PC) points to the address of the next instruction to execute.  The simulator reads the instruction from that address, figures out what operation it represents, performs the operation, and then moves the program counter forward. </w:t>
+      </w:r>
+    </w:p>
+    <w:p>
+      <w:pPr>
+        <w:rPr>
+          <w:rFonts w:ascii="Times New Roman" w:hAnsi="Times New Roman" w:cs="Times New Roman"/>
+        </w:rPr>
+      </w:pPr>
+      <w:r>
+        <w:rPr>
+          <w:rFonts w:ascii="Times New Roman" w:hAnsi="Times New Roman" w:cs="Times New Roman"/>
+        </w:rPr>
+        <w:t>The RegisterFile class will give us methods to read and write register values. When we write a value to a register, the class automatically applies modulo 256 to keep values in the correct range. Register 10 is read only, so any attempt to write to it prints a waning and does absolutely nothing.</w:t>
       </w:r>
     </w:p>
     <w:p>
@@ -76,24 +211,10 @@
           <w:rFonts w:ascii="Times New Roman" w:hAnsi="Times New Roman" w:cs="Times New Roman"/>
         </w:rPr>
       </w:pPr>
-      <w:r>
-        <w:rPr>
-          <w:rFonts w:ascii="Times New Roman" w:hAnsi="Times New Roman" w:cs="Times New Roman"/>
-        </w:rPr>
-        <w:lastRenderedPageBreak/>
-        <w:br w:type="page"/>
-      </w:r>
-    </w:p>
-    <w:p>
-      <w:pPr>
-        <w:rPr>
-          <w:rFonts w:ascii="Times New Roman" w:hAnsi="Times New Roman" w:cs="Times New Roman"/>
-        </w:rPr>
-      </w:pPr>
     </w:p>
     <w:sectPr>
-      <w:headerReference w:type="default" r:id="rId6"/>
-      <w:footerReference w:type="default" r:id="rId7"/>
+      <w:headerReference w:type="default" r:id="rId7"/>
+      <w:footerReference w:type="default" r:id="rId8"/>
       <w:pgSz w:w="12240" w:h="15840"/>
       <w:pgMar w:top="1440" w:right="1440" w:bottom="1440" w:left="1440" w:header="720" w:footer="720" w:gutter="0"/>
       <w:cols w:space="720"/>
@@ -143,15 +264,7 @@
         <w:sz w:val="15"/>
         <w:szCs w:val="15"/>
       </w:rPr>
-      <w:t xml:space="preserve">Group 17: </w:t>
-    </w:r>
-    <w:r>
-      <w:rPr>
-        <w:rFonts w:ascii="Times New Roman" w:hAnsi="Times New Roman" w:cs="Times New Roman"/>
-        <w:sz w:val="15"/>
-        <w:szCs w:val="15"/>
-      </w:rPr>
-      <w:t>Anastasios Tatarakis, Pooya Zargari, Adam Popov</w:t>
+      <w:t>Group 17: Anastasios Tatarakis, Pooya Zargari, Adam Popov</w:t>
     </w:r>
     <w:r>
       <w:rPr>
@@ -161,17 +274,6 @@
       </w:rPr>
       <w:tab/>
     </w:r>
-    <w:hyperlink r:id="rId1" w:history="1">
-      <w:r>
-        <w:rPr>
-          <w:rStyle w:val="Hyperlink"/>
-          <w:rFonts w:ascii="Times New Roman" w:hAnsi="Times New Roman" w:cs="Times New Roman"/>
-          <w:sz w:val="15"/>
-          <w:szCs w:val="15"/>
-        </w:rPr>
-        <w:t>GitHub repository</w:t>
-      </w:r>
-    </w:hyperlink>
   </w:p>
 </w:ftr>
 </file>
@@ -205,11 +307,14 @@
 <w:hdr xmlns:wpc="http://schemas.microsoft.com/office/word/2010/wordprocessingCanvas" xmlns:cx="http://schemas.microsoft.com/office/drawing/2014/chartex" xmlns:cx1="http://schemas.microsoft.com/office/drawing/2015/9/8/chartex" xmlns:cx2="http://schemas.microsoft.com/office/drawing/2015/10/21/chartex" xmlns:cx3="http://schemas.microsoft.com/office/drawing/2016/5/9/chartex" xmlns:cx4="http://schemas.microsoft.com/office/drawing/2016/5/10/chartex" xmlns:cx5="http://schemas.microsoft.com/office/drawing/2016/5/11/chartex" xmlns:cx6="http://schemas.microsoft.com/office/drawing/2016/5/12/chartex" xmlns:cx7="http://schemas.microsoft.com/office/drawing/2016/5/13/chartex" xmlns:cx8="http://schemas.microsoft.com/office/drawing/2016/5/14/chartex" xmlns:mc="http://schemas.openxmlformats.org/markup-compatibility/2006" xmlns:aink="http://schemas.microsoft.com/office/drawing/2016/ink" xmlns:am3d="http://schemas.microsoft.com/office/drawing/2017/model3d" xmlns:o="urn:schemas-microsoft-com:office:office" xmlns:oel="http://schemas.microsoft.com/office/2019/extlst" xmlns:r="http://schemas.openxmlformats.org/officeDocument/2006/relationships" xmlns:m="http://schemas.openxmlformats.org/officeDocument/2006/math" xmlns:v="urn:schemas-microsoft-com:vml" xmlns:wp14="http://schemas.microsoft.com/office/word/2010/wordprocessingDrawing" xmlns:wp="http://schemas.openxmlformats.org/drawingml/2006/wordprocessingDrawing" xmlns:w10="urn:schemas-microsoft-com:office:word" xmlns:w="http://schemas.openxmlformats.org/wordprocessingml/2006/main" xmlns:w14="http://schemas.microsoft.com/office/word/2010/wordml" xmlns:w15="http://schemas.microsoft.com/office/word/2012/wordml" xmlns:w16cex="http://schemas.microsoft.com/office/word/2018/wordml/cex" xmlns:w16cid="http://schemas.microsoft.com/office/word/2016/wordml/cid" xmlns:w16="http://schemas.microsoft.com/office/word/2018/wordml" xmlns:w16du="http://schemas.microsoft.com/office/word/2023/wordml/word16du" xmlns:w16sdtdh="http://schemas.microsoft.com/office/word/2020/wordml/sdtdatahash" xmlns:w16sdtfl="http://schemas.microsoft.com/office/word/2024/wordml/sdtformatlock" xmlns:w16se="http://schemas.microsoft.com/office/word/2015/wordml/symex" xmlns:wpg="http://schemas.microsoft.com/office/word/2010/wordprocessingGroup" xmlns:wpi="http://schemas.microsoft.com/office/word/2010/wordprocessingInk" xmlns:wne="http://schemas.microsoft.com/office/word/2006/wordml" xmlns:wps="http://schemas.microsoft.com/office/word/2010/wordprocessingShape" mc:Ignorable="w14 w15 w16se w16cid w16 w16cex w16sdtdh w16sdtfl w16du wp14">
   <w:p>
     <w:pPr>
-      <w:pStyle w:val="Header"/>
+      <w:pStyle w:val="Footer"/>
+      <w:tabs>
+        <w:tab w:val="clear" w:pos="4680"/>
+      </w:tabs>
       <w:rPr>
-        <w:rFonts w:ascii="Times New Roman" w:hAnsi="Times New Roman" w:cs="Times New Roman"/>
-        <w:sz w:val="15"/>
-        <w:szCs w:val="15"/>
+        <w:color w:val="404040" w:themeColor="text1" w:themeTint="BF"/>
+        <w:sz w:val="24"/>
+        <w:szCs w:val="24"/>
       </w:rPr>
     </w:pPr>
     <w:r>
@@ -254,14 +359,142 @@
     </w:r>
     <w:r>
       <w:rPr>
+        <w:color w:val="0D0D0D" w:themeColor="text1" w:themeTint="F2"/>
+      </w:rPr>
+      <w:fldChar w:fldCharType="begin"/>
+    </w:r>
+    <w:r>
+      <w:rPr>
+        <w:color w:val="0D0D0D" w:themeColor="text1" w:themeTint="F2"/>
+      </w:rPr>
+      <w:instrText>HYPERLINK "https://github.com/Anastasios3/Cyber_Systems_DTU.git"</w:instrText>
+    </w:r>
+    <w:r>
+      <w:rPr>
+        <w:color w:val="0D0D0D" w:themeColor="text1" w:themeTint="F2"/>
+      </w:rPr>
+    </w:r>
+    <w:r>
+      <w:rPr>
+        <w:color w:val="0D0D0D" w:themeColor="text1" w:themeTint="F2"/>
+      </w:rPr>
+      <w:fldChar w:fldCharType="separate"/>
+    </w:r>
+    <w:r>
+      <w:rPr>
+        <w:rStyle w:val="Hyperlink"/>
         <w:rFonts w:ascii="Times New Roman" w:hAnsi="Times New Roman" w:cs="Times New Roman"/>
+        <w:color w:val="0D0D0D" w:themeColor="text1" w:themeTint="F2"/>
         <w:sz w:val="15"/>
         <w:szCs w:val="15"/>
       </w:rPr>
-      <w:t>Assignment 2</w:t>
+      <w:t>GitHub repository</w:t>
+    </w:r>
+    <w:r>
+      <w:rPr>
+        <w:color w:val="0D0D0D" w:themeColor="text1" w:themeTint="F2"/>
+      </w:rPr>
+      <w:fldChar w:fldCharType="end"/>
     </w:r>
   </w:p>
 </w:hdr>
+</file>
+
+<file path=word/numbering.xml><?xml version="1.0" encoding="utf-8"?>
+<w:numbering xmlns:wpc="http://schemas.microsoft.com/office/word/2010/wordprocessingCanvas" xmlns:cx="http://schemas.microsoft.com/office/drawing/2014/chartex" xmlns:cx1="http://schemas.microsoft.com/office/drawing/2015/9/8/chartex" xmlns:cx2="http://schemas.microsoft.com/office/drawing/2015/10/21/chartex" xmlns:cx3="http://schemas.microsoft.com/office/drawing/2016/5/9/chartex" xmlns:cx4="http://schemas.microsoft.com/office/drawing/2016/5/10/chartex" xmlns:cx5="http://schemas.microsoft.com/office/drawing/2016/5/11/chartex" xmlns:cx6="http://schemas.microsoft.com/office/drawing/2016/5/12/chartex" xmlns:cx7="http://schemas.microsoft.com/office/drawing/2016/5/13/chartex" xmlns:cx8="http://schemas.microsoft.com/office/drawing/2016/5/14/chartex" xmlns:mc="http://schemas.openxmlformats.org/markup-compatibility/2006" xmlns:aink="http://schemas.microsoft.com/office/drawing/2016/ink" xmlns:am3d="http://schemas.microsoft.com/office/drawing/2017/model3d" xmlns:o="urn:schemas-microsoft-com:office:office" xmlns:oel="http://schemas.microsoft.com/office/2019/extlst" xmlns:r="http://schemas.openxmlformats.org/officeDocument/2006/relationships" xmlns:m="http://schemas.openxmlformats.org/officeDocument/2006/math" xmlns:v="urn:schemas-microsoft-com:vml" xmlns:wp14="http://schemas.microsoft.com/office/word/2010/wordprocessingDrawing" xmlns:wp="http://schemas.openxmlformats.org/drawingml/2006/wordprocessingDrawing" xmlns:w10="urn:schemas-microsoft-com:office:word" xmlns:w="http://schemas.openxmlformats.org/wordprocessingml/2006/main" xmlns:w14="http://schemas.microsoft.com/office/word/2010/wordml" xmlns:w15="http://schemas.microsoft.com/office/word/2012/wordml" xmlns:w16cex="http://schemas.microsoft.com/office/word/2018/wordml/cex" xmlns:w16cid="http://schemas.microsoft.com/office/word/2016/wordml/cid" xmlns:w16="http://schemas.microsoft.com/office/word/2018/wordml" xmlns:w16du="http://schemas.microsoft.com/office/word/2023/wordml/word16du" xmlns:w16sdtdh="http://schemas.microsoft.com/office/word/2020/wordml/sdtdatahash" xmlns:w16sdtfl="http://schemas.microsoft.com/office/word/2024/wordml/sdtformatlock" xmlns:w16se="http://schemas.microsoft.com/office/word/2015/wordml/symex" xmlns:wpg="http://schemas.microsoft.com/office/word/2010/wordprocessingGroup" xmlns:wpi="http://schemas.microsoft.com/office/word/2010/wordprocessingInk" xmlns:wne="http://schemas.microsoft.com/office/word/2006/wordml" xmlns:wps="http://schemas.microsoft.com/office/word/2010/wordprocessingShape" mc:Ignorable="w14 w15 w16se w16cid w16 w16cex w16sdtdh w16sdtfl w16du wp14">
+  <w:abstractNum w:abstractNumId="0" w15:restartNumberingAfterBreak="0">
+    <w:nsid w:val="6A9354D8"/>
+    <w:multiLevelType w:val="hybridMultilevel"/>
+    <w:tmpl w:val="AEBE4514"/>
+    <w:lvl w:ilvl="0" w:tplc="0409000F">
+      <w:start w:val="1"/>
+      <w:numFmt w:val="decimal"/>
+      <w:lvlText w:val="%1."/>
+      <w:lvlJc w:val="left"/>
+      <w:pPr>
+        <w:ind w:left="720" w:hanging="360"/>
+      </w:pPr>
+      <w:rPr>
+        <w:rFonts w:hint="default"/>
+      </w:rPr>
+    </w:lvl>
+    <w:lvl w:ilvl="1" w:tplc="04090019" w:tentative="1">
+      <w:start w:val="1"/>
+      <w:numFmt w:val="lowerLetter"/>
+      <w:lvlText w:val="%2."/>
+      <w:lvlJc w:val="left"/>
+      <w:pPr>
+        <w:ind w:left="1440" w:hanging="360"/>
+      </w:pPr>
+    </w:lvl>
+    <w:lvl w:ilvl="2" w:tplc="0409001B" w:tentative="1">
+      <w:start w:val="1"/>
+      <w:numFmt w:val="lowerRoman"/>
+      <w:lvlText w:val="%3."/>
+      <w:lvlJc w:val="right"/>
+      <w:pPr>
+        <w:ind w:left="2160" w:hanging="180"/>
+      </w:pPr>
+    </w:lvl>
+    <w:lvl w:ilvl="3" w:tplc="0409000F" w:tentative="1">
+      <w:start w:val="1"/>
+      <w:numFmt w:val="decimal"/>
+      <w:lvlText w:val="%4."/>
+      <w:lvlJc w:val="left"/>
+      <w:pPr>
+        <w:ind w:left="2880" w:hanging="360"/>
+      </w:pPr>
+    </w:lvl>
+    <w:lvl w:ilvl="4" w:tplc="04090019" w:tentative="1">
+      <w:start w:val="1"/>
+      <w:numFmt w:val="lowerLetter"/>
+      <w:lvlText w:val="%5."/>
+      <w:lvlJc w:val="left"/>
+      <w:pPr>
+        <w:ind w:left="3600" w:hanging="360"/>
+      </w:pPr>
+    </w:lvl>
+    <w:lvl w:ilvl="5" w:tplc="0409001B" w:tentative="1">
+      <w:start w:val="1"/>
+      <w:numFmt w:val="lowerRoman"/>
+      <w:lvlText w:val="%6."/>
+      <w:lvlJc w:val="right"/>
+      <w:pPr>
+        <w:ind w:left="4320" w:hanging="180"/>
+      </w:pPr>
+    </w:lvl>
+    <w:lvl w:ilvl="6" w:tplc="0409000F" w:tentative="1">
+      <w:start w:val="1"/>
+      <w:numFmt w:val="decimal"/>
+      <w:lvlText w:val="%7."/>
+      <w:lvlJc w:val="left"/>
+      <w:pPr>
+        <w:ind w:left="5040" w:hanging="360"/>
+      </w:pPr>
+    </w:lvl>
+    <w:lvl w:ilvl="7" w:tplc="04090019" w:tentative="1">
+      <w:start w:val="1"/>
+      <w:numFmt w:val="lowerLetter"/>
+      <w:lvlText w:val="%8."/>
+      <w:lvlJc w:val="left"/>
+      <w:pPr>
+        <w:ind w:left="5760" w:hanging="360"/>
+      </w:pPr>
+    </w:lvl>
+    <w:lvl w:ilvl="8" w:tplc="0409001B" w:tentative="1">
+      <w:start w:val="1"/>
+      <w:numFmt w:val="lowerRoman"/>
+      <w:lvlText w:val="%9."/>
+      <w:lvlJc w:val="right"/>
+      <w:pPr>
+        <w:ind w:left="6480" w:hanging="180"/>
+      </w:pPr>
+    </w:lvl>
+  </w:abstractNum>
+  <w:num w:numId="1" w16cid:durableId="863716975">
+    <w:abstractNumId w:val="0"/>
+  </w:num>
+</w:numbering>
 </file>
 
 <file path=word/styles.xml><?xml version="1.0" encoding="utf-8"?>
@@ -269,17 +502,15 @@
   <w:docDefaults>
     <w:rPrDefault>
       <w:rPr>
-        <w:rFonts w:asciiTheme="minorHAnsi" w:eastAsiaTheme="minorHAnsi" w:hAnsiTheme="minorHAnsi" w:cstheme="minorBidi"/>
-        <w:kern w:val="2"/>
-        <w:sz w:val="24"/>
-        <w:szCs w:val="24"/>
+        <w:rFonts w:asciiTheme="minorHAnsi" w:eastAsiaTheme="minorEastAsia" w:hAnsiTheme="minorHAnsi" w:cstheme="minorBidi"/>
+        <w:sz w:val="22"/>
+        <w:szCs w:val="22"/>
         <w:lang w:val="en-US" w:eastAsia="en-US" w:bidi="ar-SA"/>
-        <w14:ligatures w14:val="standardContextual"/>
       </w:rPr>
     </w:rPrDefault>
     <w:pPrDefault>
       <w:pPr>
-        <w:spacing w:after="160" w:line="278" w:lineRule="auto"/>
+        <w:spacing w:after="200" w:line="276" w:lineRule="auto"/>
       </w:pPr>
     </w:pPrDefault>
   </w:docDefaults>
@@ -664,6 +895,7 @@
   <w:style w:type="paragraph" w:default="1" w:styleId="Normal">
     <w:name w:val="Normal"/>
     <w:qFormat/>
+    <w:rsid w:val="003F230C"/>
   </w:style>
   <w:style w:type="paragraph" w:styleId="Heading1">
     <w:name w:val="heading 1"/>
@@ -672,18 +904,20 @@
     <w:link w:val="Heading1Char"/>
     <w:uiPriority w:val="9"/>
     <w:qFormat/>
-    <w:rsid w:val="004B2F76"/>
+    <w:rsid w:val="003F230C"/>
     <w:pPr>
       <w:keepNext/>
       <w:keepLines/>
-      <w:spacing w:before="360" w:after="80"/>
+      <w:spacing w:before="480" w:after="0"/>
       <w:outlineLvl w:val="0"/>
     </w:pPr>
     <w:rPr>
       <w:rFonts w:asciiTheme="majorHAnsi" w:eastAsiaTheme="majorEastAsia" w:hAnsiTheme="majorHAnsi" w:cstheme="majorBidi"/>
-      <w:color w:val="0F4761" w:themeColor="accent1" w:themeShade="BF"/>
-      <w:sz w:val="40"/>
-      <w:szCs w:val="40"/>
+      <w:b/>
+      <w:bCs/>
+      <w:color w:val="0B5294" w:themeColor="accent1" w:themeShade="BF"/>
+      <w:sz w:val="28"/>
+      <w:szCs w:val="28"/>
     </w:rPr>
   </w:style>
   <w:style w:type="paragraph" w:styleId="Heading2">
@@ -695,18 +929,20 @@
     <w:semiHidden/>
     <w:unhideWhenUsed/>
     <w:qFormat/>
-    <w:rsid w:val="004B2F76"/>
+    <w:rsid w:val="003F230C"/>
     <w:pPr>
       <w:keepNext/>
       <w:keepLines/>
-      <w:spacing w:before="160" w:after="80"/>
+      <w:spacing w:before="200" w:after="0"/>
       <w:outlineLvl w:val="1"/>
     </w:pPr>
     <w:rPr>
       <w:rFonts w:asciiTheme="majorHAnsi" w:eastAsiaTheme="majorEastAsia" w:hAnsiTheme="majorHAnsi" w:cstheme="majorBidi"/>
-      <w:color w:val="0F4761" w:themeColor="accent1" w:themeShade="BF"/>
-      <w:sz w:val="32"/>
-      <w:szCs w:val="32"/>
+      <w:b/>
+      <w:bCs/>
+      <w:color w:val="0F6FC6" w:themeColor="accent1"/>
+      <w:sz w:val="26"/>
+      <w:szCs w:val="26"/>
     </w:rPr>
   </w:style>
   <w:style w:type="paragraph" w:styleId="Heading3">
@@ -718,18 +954,18 @@
     <w:semiHidden/>
     <w:unhideWhenUsed/>
     <w:qFormat/>
-    <w:rsid w:val="004B2F76"/>
+    <w:rsid w:val="003F230C"/>
     <w:pPr>
       <w:keepNext/>
       <w:keepLines/>
-      <w:spacing w:before="160" w:after="80"/>
+      <w:spacing w:before="200" w:after="0"/>
       <w:outlineLvl w:val="2"/>
     </w:pPr>
     <w:rPr>
-      <w:rFonts w:eastAsiaTheme="majorEastAsia" w:cstheme="majorBidi"/>
-      <w:color w:val="0F4761" w:themeColor="accent1" w:themeShade="BF"/>
-      <w:sz w:val="28"/>
-      <w:szCs w:val="28"/>
+      <w:rFonts w:asciiTheme="majorHAnsi" w:eastAsiaTheme="majorEastAsia" w:hAnsiTheme="majorHAnsi" w:cstheme="majorBidi"/>
+      <w:b/>
+      <w:bCs/>
+      <w:color w:val="0F6FC6" w:themeColor="accent1"/>
     </w:rPr>
   </w:style>
   <w:style w:type="paragraph" w:styleId="Heading4">
@@ -741,18 +977,20 @@
     <w:semiHidden/>
     <w:unhideWhenUsed/>
     <w:qFormat/>
-    <w:rsid w:val="004B2F76"/>
+    <w:rsid w:val="003F230C"/>
     <w:pPr>
       <w:keepNext/>
       <w:keepLines/>
-      <w:spacing w:before="80" w:after="40"/>
+      <w:spacing w:before="200" w:after="0"/>
       <w:outlineLvl w:val="3"/>
     </w:pPr>
     <w:rPr>
-      <w:rFonts w:eastAsiaTheme="majorEastAsia" w:cstheme="majorBidi"/>
+      <w:rFonts w:asciiTheme="majorHAnsi" w:eastAsiaTheme="majorEastAsia" w:hAnsiTheme="majorHAnsi" w:cstheme="majorBidi"/>
+      <w:b/>
+      <w:bCs/>
       <w:i/>
       <w:iCs/>
-      <w:color w:val="0F4761" w:themeColor="accent1" w:themeShade="BF"/>
+      <w:color w:val="0F6FC6" w:themeColor="accent1"/>
     </w:rPr>
   </w:style>
   <w:style w:type="paragraph" w:styleId="Heading5">
@@ -764,16 +1002,16 @@
     <w:semiHidden/>
     <w:unhideWhenUsed/>
     <w:qFormat/>
-    <w:rsid w:val="004B2F76"/>
+    <w:rsid w:val="003F230C"/>
     <w:pPr>
       <w:keepNext/>
       <w:keepLines/>
-      <w:spacing w:before="80" w:after="40"/>
+      <w:spacing w:before="200" w:after="0"/>
       <w:outlineLvl w:val="4"/>
     </w:pPr>
     <w:rPr>
-      <w:rFonts w:eastAsiaTheme="majorEastAsia" w:cstheme="majorBidi"/>
-      <w:color w:val="0F4761" w:themeColor="accent1" w:themeShade="BF"/>
+      <w:rFonts w:asciiTheme="majorHAnsi" w:eastAsiaTheme="majorEastAsia" w:hAnsiTheme="majorHAnsi" w:cstheme="majorBidi"/>
+      <w:color w:val="073662" w:themeColor="accent1" w:themeShade="7F"/>
     </w:rPr>
   </w:style>
   <w:style w:type="paragraph" w:styleId="Heading6">
@@ -785,18 +1023,18 @@
     <w:semiHidden/>
     <w:unhideWhenUsed/>
     <w:qFormat/>
-    <w:rsid w:val="004B2F76"/>
+    <w:rsid w:val="003F230C"/>
     <w:pPr>
       <w:keepNext/>
       <w:keepLines/>
-      <w:spacing w:before="40" w:after="0"/>
+      <w:spacing w:before="200" w:after="0"/>
       <w:outlineLvl w:val="5"/>
     </w:pPr>
     <w:rPr>
-      <w:rFonts w:eastAsiaTheme="majorEastAsia" w:cstheme="majorBidi"/>
+      <w:rFonts w:asciiTheme="majorHAnsi" w:eastAsiaTheme="majorEastAsia" w:hAnsiTheme="majorHAnsi" w:cstheme="majorBidi"/>
       <w:i/>
       <w:iCs/>
-      <w:color w:val="595959" w:themeColor="text1" w:themeTint="A6"/>
+      <w:color w:val="073662" w:themeColor="accent1" w:themeShade="7F"/>
     </w:rPr>
   </w:style>
   <w:style w:type="paragraph" w:styleId="Heading7">
@@ -808,16 +1046,18 @@
     <w:semiHidden/>
     <w:unhideWhenUsed/>
     <w:qFormat/>
-    <w:rsid w:val="004B2F76"/>
+    <w:rsid w:val="003F230C"/>
     <w:pPr>
       <w:keepNext/>
       <w:keepLines/>
-      <w:spacing w:before="40" w:after="0"/>
+      <w:spacing w:before="200" w:after="0"/>
       <w:outlineLvl w:val="6"/>
     </w:pPr>
     <w:rPr>
-      <w:rFonts w:eastAsiaTheme="majorEastAsia" w:cstheme="majorBidi"/>
-      <w:color w:val="595959" w:themeColor="text1" w:themeTint="A6"/>
+      <w:rFonts w:asciiTheme="majorHAnsi" w:eastAsiaTheme="majorEastAsia" w:hAnsiTheme="majorHAnsi" w:cstheme="majorBidi"/>
+      <w:i/>
+      <w:iCs/>
+      <w:color w:val="404040" w:themeColor="text1" w:themeTint="BF"/>
     </w:rPr>
   </w:style>
   <w:style w:type="paragraph" w:styleId="Heading8">
@@ -829,18 +1069,18 @@
     <w:semiHidden/>
     <w:unhideWhenUsed/>
     <w:qFormat/>
-    <w:rsid w:val="004B2F76"/>
+    <w:rsid w:val="003F230C"/>
     <w:pPr>
       <w:keepNext/>
       <w:keepLines/>
-      <w:spacing w:after="0"/>
+      <w:spacing w:before="200" w:after="0"/>
       <w:outlineLvl w:val="7"/>
     </w:pPr>
     <w:rPr>
-      <w:rFonts w:eastAsiaTheme="majorEastAsia" w:cstheme="majorBidi"/>
-      <w:i/>
-      <w:iCs/>
-      <w:color w:val="272727" w:themeColor="text1" w:themeTint="D8"/>
+      <w:rFonts w:asciiTheme="majorHAnsi" w:eastAsiaTheme="majorEastAsia" w:hAnsiTheme="majorHAnsi" w:cstheme="majorBidi"/>
+      <w:color w:val="0F6FC6" w:themeColor="accent1"/>
+      <w:sz w:val="20"/>
+      <w:szCs w:val="20"/>
     </w:rPr>
   </w:style>
   <w:style w:type="paragraph" w:styleId="Heading9">
@@ -852,16 +1092,20 @@
     <w:semiHidden/>
     <w:unhideWhenUsed/>
     <w:qFormat/>
-    <w:rsid w:val="004B2F76"/>
+    <w:rsid w:val="003F230C"/>
     <w:pPr>
       <w:keepNext/>
       <w:keepLines/>
-      <w:spacing w:after="0"/>
+      <w:spacing w:before="200" w:after="0"/>
       <w:outlineLvl w:val="8"/>
     </w:pPr>
     <w:rPr>
-      <w:rFonts w:eastAsiaTheme="majorEastAsia" w:cstheme="majorBidi"/>
-      <w:color w:val="272727" w:themeColor="text1" w:themeTint="D8"/>
+      <w:rFonts w:asciiTheme="majorHAnsi" w:eastAsiaTheme="majorEastAsia" w:hAnsiTheme="majorHAnsi" w:cstheme="majorBidi"/>
+      <w:i/>
+      <w:iCs/>
+      <w:color w:val="404040" w:themeColor="text1" w:themeTint="BF"/>
+      <w:sz w:val="20"/>
+      <w:szCs w:val="20"/>
     </w:rPr>
   </w:style>
   <w:style w:type="character" w:default="1" w:styleId="DefaultParagraphFont">
@@ -896,12 +1140,14 @@
     <w:basedOn w:val="DefaultParagraphFont"/>
     <w:link w:val="Heading1"/>
     <w:uiPriority w:val="9"/>
-    <w:rsid w:val="004B2F76"/>
-    <w:rPr>
-      <w:rFonts w:asciiTheme="majorHAnsi" w:eastAsiaTheme="majorEastAsia" w:hAnsiTheme="majorHAnsi" w:cstheme="majorBidi"/>
-      <w:color w:val="0F4761" w:themeColor="accent1" w:themeShade="BF"/>
-      <w:sz w:val="40"/>
-      <w:szCs w:val="40"/>
+    <w:rsid w:val="003F230C"/>
+    <w:rPr>
+      <w:rFonts w:asciiTheme="majorHAnsi" w:eastAsiaTheme="majorEastAsia" w:hAnsiTheme="majorHAnsi" w:cstheme="majorBidi"/>
+      <w:b/>
+      <w:bCs/>
+      <w:color w:val="0B5294" w:themeColor="accent1" w:themeShade="BF"/>
+      <w:sz w:val="28"/>
+      <w:szCs w:val="28"/>
     </w:rPr>
   </w:style>
   <w:style w:type="character" w:customStyle="1" w:styleId="Heading2Char">
@@ -910,12 +1156,14 @@
     <w:link w:val="Heading2"/>
     <w:uiPriority w:val="9"/>
     <w:semiHidden/>
-    <w:rsid w:val="004B2F76"/>
-    <w:rPr>
-      <w:rFonts w:asciiTheme="majorHAnsi" w:eastAsiaTheme="majorEastAsia" w:hAnsiTheme="majorHAnsi" w:cstheme="majorBidi"/>
-      <w:color w:val="0F4761" w:themeColor="accent1" w:themeShade="BF"/>
-      <w:sz w:val="32"/>
-      <w:szCs w:val="32"/>
+    <w:rsid w:val="003F230C"/>
+    <w:rPr>
+      <w:rFonts w:asciiTheme="majorHAnsi" w:eastAsiaTheme="majorEastAsia" w:hAnsiTheme="majorHAnsi" w:cstheme="majorBidi"/>
+      <w:b/>
+      <w:bCs/>
+      <w:color w:val="0F6FC6" w:themeColor="accent1"/>
+      <w:sz w:val="26"/>
+      <w:szCs w:val="26"/>
     </w:rPr>
   </w:style>
   <w:style w:type="character" w:customStyle="1" w:styleId="Heading3Char">
@@ -924,12 +1172,12 @@
     <w:link w:val="Heading3"/>
     <w:uiPriority w:val="9"/>
     <w:semiHidden/>
-    <w:rsid w:val="004B2F76"/>
-    <w:rPr>
-      <w:rFonts w:eastAsiaTheme="majorEastAsia" w:cstheme="majorBidi"/>
-      <w:color w:val="0F4761" w:themeColor="accent1" w:themeShade="BF"/>
-      <w:sz w:val="28"/>
-      <w:szCs w:val="28"/>
+    <w:rsid w:val="003F230C"/>
+    <w:rPr>
+      <w:rFonts w:asciiTheme="majorHAnsi" w:eastAsiaTheme="majorEastAsia" w:hAnsiTheme="majorHAnsi" w:cstheme="majorBidi"/>
+      <w:b/>
+      <w:bCs/>
+      <w:color w:val="0F6FC6" w:themeColor="accent1"/>
     </w:rPr>
   </w:style>
   <w:style w:type="character" w:customStyle="1" w:styleId="Heading4Char">
@@ -938,12 +1186,14 @@
     <w:link w:val="Heading4"/>
     <w:uiPriority w:val="9"/>
     <w:semiHidden/>
-    <w:rsid w:val="004B2F76"/>
-    <w:rPr>
-      <w:rFonts w:eastAsiaTheme="majorEastAsia" w:cstheme="majorBidi"/>
+    <w:rsid w:val="003F230C"/>
+    <w:rPr>
+      <w:rFonts w:asciiTheme="majorHAnsi" w:eastAsiaTheme="majorEastAsia" w:hAnsiTheme="majorHAnsi" w:cstheme="majorBidi"/>
+      <w:b/>
+      <w:bCs/>
       <w:i/>
       <w:iCs/>
-      <w:color w:val="0F4761" w:themeColor="accent1" w:themeShade="BF"/>
+      <w:color w:val="0F6FC6" w:themeColor="accent1"/>
     </w:rPr>
   </w:style>
   <w:style w:type="character" w:customStyle="1" w:styleId="Heading5Char">
@@ -952,10 +1202,10 @@
     <w:link w:val="Heading5"/>
     <w:uiPriority w:val="9"/>
     <w:semiHidden/>
-    <w:rsid w:val="004B2F76"/>
-    <w:rPr>
-      <w:rFonts w:eastAsiaTheme="majorEastAsia" w:cstheme="majorBidi"/>
-      <w:color w:val="0F4761" w:themeColor="accent1" w:themeShade="BF"/>
+    <w:rsid w:val="003F230C"/>
+    <w:rPr>
+      <w:rFonts w:asciiTheme="majorHAnsi" w:eastAsiaTheme="majorEastAsia" w:hAnsiTheme="majorHAnsi" w:cstheme="majorBidi"/>
+      <w:color w:val="073662" w:themeColor="accent1" w:themeShade="7F"/>
     </w:rPr>
   </w:style>
   <w:style w:type="character" w:customStyle="1" w:styleId="Heading6Char">
@@ -964,12 +1214,12 @@
     <w:link w:val="Heading6"/>
     <w:uiPriority w:val="9"/>
     <w:semiHidden/>
-    <w:rsid w:val="004B2F76"/>
-    <w:rPr>
-      <w:rFonts w:eastAsiaTheme="majorEastAsia" w:cstheme="majorBidi"/>
+    <w:rsid w:val="003F230C"/>
+    <w:rPr>
+      <w:rFonts w:asciiTheme="majorHAnsi" w:eastAsiaTheme="majorEastAsia" w:hAnsiTheme="majorHAnsi" w:cstheme="majorBidi"/>
       <w:i/>
       <w:iCs/>
-      <w:color w:val="595959" w:themeColor="text1" w:themeTint="A6"/>
+      <w:color w:val="073662" w:themeColor="accent1" w:themeShade="7F"/>
     </w:rPr>
   </w:style>
   <w:style w:type="character" w:customStyle="1" w:styleId="Heading7Char">
@@ -978,10 +1228,12 @@
     <w:link w:val="Heading7"/>
     <w:uiPriority w:val="9"/>
     <w:semiHidden/>
-    <w:rsid w:val="004B2F76"/>
-    <w:rPr>
-      <w:rFonts w:eastAsiaTheme="majorEastAsia" w:cstheme="majorBidi"/>
-      <w:color w:val="595959" w:themeColor="text1" w:themeTint="A6"/>
+    <w:rsid w:val="003F230C"/>
+    <w:rPr>
+      <w:rFonts w:asciiTheme="majorHAnsi" w:eastAsiaTheme="majorEastAsia" w:hAnsiTheme="majorHAnsi" w:cstheme="majorBidi"/>
+      <w:i/>
+      <w:iCs/>
+      <w:color w:val="404040" w:themeColor="text1" w:themeTint="BF"/>
     </w:rPr>
   </w:style>
   <w:style w:type="character" w:customStyle="1" w:styleId="Heading8Char">
@@ -990,24 +1242,28 @@
     <w:link w:val="Heading8"/>
     <w:uiPriority w:val="9"/>
     <w:semiHidden/>
-    <w:rsid w:val="004B2F76"/>
-    <w:rPr>
-      <w:rFonts w:eastAsiaTheme="majorEastAsia" w:cstheme="majorBidi"/>
+    <w:rsid w:val="003F230C"/>
+    <w:rPr>
+      <w:rFonts w:asciiTheme="majorHAnsi" w:eastAsiaTheme="majorEastAsia" w:hAnsiTheme="majorHAnsi" w:cstheme="majorBidi"/>
+      <w:color w:val="0F6FC6" w:themeColor="accent1"/>
+      <w:sz w:val="20"/>
+      <w:szCs w:val="20"/>
+    </w:rPr>
+  </w:style>
+  <w:style w:type="character" w:customStyle="1" w:styleId="Heading9Char">
+    <w:name w:val="Heading 9 Char"/>
+    <w:basedOn w:val="DefaultParagraphFont"/>
+    <w:link w:val="Heading9"/>
+    <w:uiPriority w:val="9"/>
+    <w:semiHidden/>
+    <w:rsid w:val="003F230C"/>
+    <w:rPr>
+      <w:rFonts w:asciiTheme="majorHAnsi" w:eastAsiaTheme="majorEastAsia" w:hAnsiTheme="majorHAnsi" w:cstheme="majorBidi"/>
       <w:i/>
       <w:iCs/>
-      <w:color w:val="272727" w:themeColor="text1" w:themeTint="D8"/>
-    </w:rPr>
-  </w:style>
-  <w:style w:type="character" w:customStyle="1" w:styleId="Heading9Char">
-    <w:name w:val="Heading 9 Char"/>
-    <w:basedOn w:val="DefaultParagraphFont"/>
-    <w:link w:val="Heading9"/>
-    <w:uiPriority w:val="9"/>
-    <w:semiHidden/>
-    <w:rsid w:val="004B2F76"/>
-    <w:rPr>
-      <w:rFonts w:eastAsiaTheme="majorEastAsia" w:cstheme="majorBidi"/>
-      <w:color w:val="272727" w:themeColor="text1" w:themeTint="D8"/>
+      <w:color w:val="404040" w:themeColor="text1" w:themeTint="BF"/>
+      <w:sz w:val="20"/>
+      <w:szCs w:val="20"/>
     </w:rPr>
   </w:style>
   <w:style w:type="paragraph" w:styleId="Title">
@@ -1017,17 +1273,21 @@
     <w:link w:val="TitleChar"/>
     <w:uiPriority w:val="10"/>
     <w:qFormat/>
-    <w:rsid w:val="004B2F76"/>
+    <w:rsid w:val="003F230C"/>
     <w:pPr>
-      <w:spacing w:after="80" w:line="240" w:lineRule="auto"/>
+      <w:pBdr>
+        <w:bottom w:val="single" w:sz="8" w:space="4" w:color="0F6FC6" w:themeColor="accent1"/>
+      </w:pBdr>
+      <w:spacing w:after="300" w:line="240" w:lineRule="auto"/>
       <w:contextualSpacing/>
     </w:pPr>
     <w:rPr>
       <w:rFonts w:asciiTheme="majorHAnsi" w:eastAsiaTheme="majorEastAsia" w:hAnsiTheme="majorHAnsi" w:cstheme="majorBidi"/>
-      <w:spacing w:val="-10"/>
+      <w:color w:val="112F51" w:themeColor="text2" w:themeShade="BF"/>
+      <w:spacing w:val="5"/>
       <w:kern w:val="28"/>
-      <w:sz w:val="56"/>
-      <w:szCs w:val="56"/>
+      <w:sz w:val="52"/>
+      <w:szCs w:val="52"/>
     </w:rPr>
   </w:style>
   <w:style w:type="character" w:customStyle="1" w:styleId="TitleChar">
@@ -1035,13 +1295,14 @@
     <w:basedOn w:val="DefaultParagraphFont"/>
     <w:link w:val="Title"/>
     <w:uiPriority w:val="10"/>
-    <w:rsid w:val="004B2F76"/>
-    <w:rPr>
-      <w:rFonts w:asciiTheme="majorHAnsi" w:eastAsiaTheme="majorEastAsia" w:hAnsiTheme="majorHAnsi" w:cstheme="majorBidi"/>
-      <w:spacing w:val="-10"/>
+    <w:rsid w:val="003F230C"/>
+    <w:rPr>
+      <w:rFonts w:asciiTheme="majorHAnsi" w:eastAsiaTheme="majorEastAsia" w:hAnsiTheme="majorHAnsi" w:cstheme="majorBidi"/>
+      <w:color w:val="112F51" w:themeColor="text2" w:themeShade="BF"/>
+      <w:spacing w:val="5"/>
       <w:kern w:val="28"/>
-      <w:sz w:val="56"/>
-      <w:szCs w:val="56"/>
+      <w:sz w:val="52"/>
+      <w:szCs w:val="52"/>
     </w:rPr>
   </w:style>
   <w:style w:type="paragraph" w:styleId="Subtitle">
@@ -1051,18 +1312,20 @@
     <w:link w:val="SubtitleChar"/>
     <w:uiPriority w:val="11"/>
     <w:qFormat/>
-    <w:rsid w:val="004B2F76"/>
+    <w:rsid w:val="003F230C"/>
     <w:pPr>
       <w:numPr>
         <w:ilvl w:val="1"/>
       </w:numPr>
     </w:pPr>
     <w:rPr>
-      <w:rFonts w:eastAsiaTheme="majorEastAsia" w:cstheme="majorBidi"/>
-      <w:color w:val="595959" w:themeColor="text1" w:themeTint="A6"/>
+      <w:rFonts w:asciiTheme="majorHAnsi" w:eastAsiaTheme="majorEastAsia" w:hAnsiTheme="majorHAnsi" w:cstheme="majorBidi"/>
+      <w:i/>
+      <w:iCs/>
+      <w:color w:val="0F6FC6" w:themeColor="accent1"/>
       <w:spacing w:val="15"/>
-      <w:sz w:val="28"/>
-      <w:szCs w:val="28"/>
+      <w:sz w:val="24"/>
+      <w:szCs w:val="24"/>
     </w:rPr>
   </w:style>
   <w:style w:type="character" w:customStyle="1" w:styleId="SubtitleChar">
@@ -1070,13 +1333,15 @@
     <w:basedOn w:val="DefaultParagraphFont"/>
     <w:link w:val="Subtitle"/>
     <w:uiPriority w:val="11"/>
-    <w:rsid w:val="004B2F76"/>
-    <w:rPr>
-      <w:rFonts w:eastAsiaTheme="majorEastAsia" w:cstheme="majorBidi"/>
-      <w:color w:val="595959" w:themeColor="text1" w:themeTint="A6"/>
+    <w:rsid w:val="003F230C"/>
+    <w:rPr>
+      <w:rFonts w:asciiTheme="majorHAnsi" w:eastAsiaTheme="majorEastAsia" w:hAnsiTheme="majorHAnsi" w:cstheme="majorBidi"/>
+      <w:i/>
+      <w:iCs/>
+      <w:color w:val="0F6FC6" w:themeColor="accent1"/>
       <w:spacing w:val="15"/>
-      <w:sz w:val="28"/>
-      <w:szCs w:val="28"/>
+      <w:sz w:val="24"/>
+      <w:szCs w:val="24"/>
     </w:rPr>
   </w:style>
   <w:style w:type="paragraph" w:styleId="Quote">
@@ -1086,15 +1351,11 @@
     <w:link w:val="QuoteChar"/>
     <w:uiPriority w:val="29"/>
     <w:qFormat/>
-    <w:rsid w:val="004B2F76"/>
-    <w:pPr>
-      <w:spacing w:before="160"/>
-      <w:jc w:val="center"/>
-    </w:pPr>
+    <w:rsid w:val="003F230C"/>
     <w:rPr>
       <w:i/>
       <w:iCs/>
-      <w:color w:val="404040" w:themeColor="text1" w:themeTint="BF"/>
+      <w:color w:val="000000" w:themeColor="text1"/>
     </w:rPr>
   </w:style>
   <w:style w:type="character" w:customStyle="1" w:styleId="QuoteChar">
@@ -1102,11 +1363,11 @@
     <w:basedOn w:val="DefaultParagraphFont"/>
     <w:link w:val="Quote"/>
     <w:uiPriority w:val="29"/>
-    <w:rsid w:val="004B2F76"/>
+    <w:rsid w:val="003F230C"/>
     <w:rPr>
       <w:i/>
       <w:iCs/>
-      <w:color w:val="404040" w:themeColor="text1" w:themeTint="BF"/>
+      <w:color w:val="000000" w:themeColor="text1"/>
     </w:rPr>
   </w:style>
   <w:style w:type="paragraph" w:styleId="ListParagraph">
@@ -1114,7 +1375,7 @@
     <w:basedOn w:val="Normal"/>
     <w:uiPriority w:val="34"/>
     <w:qFormat/>
-    <w:rsid w:val="004B2F76"/>
+    <w:rsid w:val="003F230C"/>
     <w:pPr>
       <w:ind w:left="720"/>
       <w:contextualSpacing/>
@@ -1125,11 +1386,13 @@
     <w:basedOn w:val="DefaultParagraphFont"/>
     <w:uiPriority w:val="21"/>
     <w:qFormat/>
-    <w:rsid w:val="004B2F76"/>
-    <w:rPr>
+    <w:rsid w:val="003F230C"/>
+    <w:rPr>
+      <w:b/>
+      <w:bCs/>
       <w:i/>
       <w:iCs/>
-      <w:color w:val="0F4761" w:themeColor="accent1" w:themeShade="BF"/>
+      <w:color w:val="0F6FC6" w:themeColor="accent1"/>
     </w:rPr>
   </w:style>
   <w:style w:type="paragraph" w:styleId="IntenseQuote">
@@ -1139,20 +1402,20 @@
     <w:link w:val="IntenseQuoteChar"/>
     <w:uiPriority w:val="30"/>
     <w:qFormat/>
-    <w:rsid w:val="004B2F76"/>
+    <w:rsid w:val="003F230C"/>
     <w:pPr>
       <w:pBdr>
-        <w:top w:val="single" w:sz="4" w:space="10" w:color="0F4761" w:themeColor="accent1" w:themeShade="BF"/>
-        <w:bottom w:val="single" w:sz="4" w:space="10" w:color="0F4761" w:themeColor="accent1" w:themeShade="BF"/>
+        <w:bottom w:val="single" w:sz="4" w:space="4" w:color="0F6FC6" w:themeColor="accent1"/>
       </w:pBdr>
-      <w:spacing w:before="360" w:after="360"/>
-      <w:ind w:left="864" w:right="864"/>
-      <w:jc w:val="center"/>
+      <w:spacing w:before="200" w:after="280"/>
+      <w:ind w:left="936" w:right="936"/>
     </w:pPr>
     <w:rPr>
+      <w:b/>
+      <w:bCs/>
       <w:i/>
       <w:iCs/>
-      <w:color w:val="0F4761" w:themeColor="accent1" w:themeShade="BF"/>
+      <w:color w:val="0F6FC6" w:themeColor="accent1"/>
     </w:rPr>
   </w:style>
   <w:style w:type="character" w:customStyle="1" w:styleId="IntenseQuoteChar">
@@ -1160,11 +1423,13 @@
     <w:basedOn w:val="DefaultParagraphFont"/>
     <w:link w:val="IntenseQuote"/>
     <w:uiPriority w:val="30"/>
-    <w:rsid w:val="004B2F76"/>
-    <w:rPr>
+    <w:rsid w:val="003F230C"/>
+    <w:rPr>
+      <w:b/>
+      <w:bCs/>
       <w:i/>
       <w:iCs/>
-      <w:color w:val="0F4761" w:themeColor="accent1" w:themeShade="BF"/>
+      <w:color w:val="0F6FC6" w:themeColor="accent1"/>
     </w:rPr>
   </w:style>
   <w:style w:type="character" w:styleId="IntenseReference">
@@ -1172,13 +1437,14 @@
     <w:basedOn w:val="DefaultParagraphFont"/>
     <w:uiPriority w:val="32"/>
     <w:qFormat/>
-    <w:rsid w:val="004B2F76"/>
+    <w:rsid w:val="003F230C"/>
     <w:rPr>
       <w:b/>
       <w:bCs/>
       <w:smallCaps/>
-      <w:color w:val="0F4761" w:themeColor="accent1" w:themeShade="BF"/>
+      <w:color w:val="009DD9" w:themeColor="accent2"/>
       <w:spacing w:val="5"/>
+      <w:u w:val="single"/>
     </w:rPr>
   </w:style>
   <w:style w:type="paragraph" w:styleId="Header">
@@ -1232,7 +1498,7 @@
     <w:unhideWhenUsed/>
     <w:rsid w:val="00F37710"/>
     <w:rPr>
-      <w:color w:val="467886" w:themeColor="hyperlink"/>
+      <w:color w:val="F49100" w:themeColor="hyperlink"/>
       <w:u w:val="single"/>
     </w:rPr>
   </w:style>
@@ -1247,6 +1513,107 @@
       <w:color w:val="605E5C"/>
       <w:shd w:val="clear" w:color="auto" w:fill="E1DFDD"/>
     </w:rPr>
+  </w:style>
+  <w:style w:type="paragraph" w:styleId="Caption">
+    <w:name w:val="caption"/>
+    <w:basedOn w:val="Normal"/>
+    <w:next w:val="Normal"/>
+    <w:uiPriority w:val="35"/>
+    <w:semiHidden/>
+    <w:unhideWhenUsed/>
+    <w:qFormat/>
+    <w:rsid w:val="003F230C"/>
+    <w:pPr>
+      <w:spacing w:line="240" w:lineRule="auto"/>
+    </w:pPr>
+    <w:rPr>
+      <w:b/>
+      <w:bCs/>
+      <w:color w:val="0F6FC6" w:themeColor="accent1"/>
+      <w:sz w:val="18"/>
+      <w:szCs w:val="18"/>
+    </w:rPr>
+  </w:style>
+  <w:style w:type="character" w:styleId="Strong">
+    <w:name w:val="Strong"/>
+    <w:basedOn w:val="DefaultParagraphFont"/>
+    <w:uiPriority w:val="22"/>
+    <w:qFormat/>
+    <w:rsid w:val="003F230C"/>
+    <w:rPr>
+      <w:b/>
+      <w:bCs/>
+    </w:rPr>
+  </w:style>
+  <w:style w:type="character" w:styleId="Emphasis">
+    <w:name w:val="Emphasis"/>
+    <w:basedOn w:val="DefaultParagraphFont"/>
+    <w:uiPriority w:val="20"/>
+    <w:qFormat/>
+    <w:rsid w:val="003F230C"/>
+    <w:rPr>
+      <w:i/>
+      <w:iCs/>
+    </w:rPr>
+  </w:style>
+  <w:style w:type="paragraph" w:styleId="NoSpacing">
+    <w:name w:val="No Spacing"/>
+    <w:uiPriority w:val="1"/>
+    <w:qFormat/>
+    <w:rsid w:val="003F230C"/>
+    <w:pPr>
+      <w:spacing w:after="0" w:line="240" w:lineRule="auto"/>
+    </w:pPr>
+  </w:style>
+  <w:style w:type="character" w:styleId="SubtleEmphasis">
+    <w:name w:val="Subtle Emphasis"/>
+    <w:basedOn w:val="DefaultParagraphFont"/>
+    <w:uiPriority w:val="19"/>
+    <w:qFormat/>
+    <w:rsid w:val="003F230C"/>
+    <w:rPr>
+      <w:i/>
+      <w:iCs/>
+      <w:color w:val="808080" w:themeColor="text1" w:themeTint="7F"/>
+    </w:rPr>
+  </w:style>
+  <w:style w:type="character" w:styleId="SubtleReference">
+    <w:name w:val="Subtle Reference"/>
+    <w:basedOn w:val="DefaultParagraphFont"/>
+    <w:uiPriority w:val="31"/>
+    <w:qFormat/>
+    <w:rsid w:val="003F230C"/>
+    <w:rPr>
+      <w:smallCaps/>
+      <w:color w:val="009DD9" w:themeColor="accent2"/>
+      <w:u w:val="single"/>
+    </w:rPr>
+  </w:style>
+  <w:style w:type="character" w:styleId="BookTitle">
+    <w:name w:val="Book Title"/>
+    <w:basedOn w:val="DefaultParagraphFont"/>
+    <w:uiPriority w:val="33"/>
+    <w:qFormat/>
+    <w:rsid w:val="003F230C"/>
+    <w:rPr>
+      <w:b/>
+      <w:bCs/>
+      <w:smallCaps/>
+      <w:spacing w:val="5"/>
+    </w:rPr>
+  </w:style>
+  <w:style w:type="paragraph" w:styleId="TOCHeading">
+    <w:name w:val="TOC Heading"/>
+    <w:basedOn w:val="Heading1"/>
+    <w:next w:val="Normal"/>
+    <w:uiPriority w:val="39"/>
+    <w:semiHidden/>
+    <w:unhideWhenUsed/>
+    <w:qFormat/>
+    <w:rsid w:val="003F230C"/>
+    <w:pPr>
+      <w:outlineLvl w:val="9"/>
+    </w:pPr>
   </w:style>
 </w:styles>
 </file>
@@ -1254,7 +1621,7 @@
 <file path=word/theme/theme1.xml><?xml version="1.0" encoding="utf-8"?>
 <a:theme xmlns:a="http://schemas.openxmlformats.org/drawingml/2006/main" name="Office Theme">
   <a:themeElements>
-    <a:clrScheme name="Office">
+    <a:clrScheme name="Blue">
       <a:dk1>
         <a:sysClr val="windowText" lastClr="000000"/>
       </a:dk1>
@@ -1262,34 +1629,34 @@
         <a:sysClr val="window" lastClr="FFFFFF"/>
       </a:lt1>
       <a:dk2>
-        <a:srgbClr val="0E2841"/>
+        <a:srgbClr val="17406D"/>
       </a:dk2>
       <a:lt2>
-        <a:srgbClr val="E8E8E8"/>
+        <a:srgbClr val="DBEFF9"/>
       </a:lt2>
       <a:accent1>
-        <a:srgbClr val="156082"/>
+        <a:srgbClr val="0F6FC6"/>
       </a:accent1>
       <a:accent2>
-        <a:srgbClr val="E97132"/>
+        <a:srgbClr val="009DD9"/>
       </a:accent2>
       <a:accent3>
-        <a:srgbClr val="196B24"/>
+        <a:srgbClr val="0BD0D9"/>
       </a:accent3>
       <a:accent4>
-        <a:srgbClr val="0F9ED5"/>
+        <a:srgbClr val="10CF9B"/>
       </a:accent4>
       <a:accent5>
-        <a:srgbClr val="A02B93"/>
+        <a:srgbClr val="7CCA62"/>
       </a:accent5>
       <a:accent6>
-        <a:srgbClr val="4EA72E"/>
+        <a:srgbClr val="A5C249"/>
       </a:accent6>
       <a:hlink>
-        <a:srgbClr val="467886"/>
+        <a:srgbClr val="F49100"/>
       </a:hlink>
       <a:folHlink>
-        <a:srgbClr val="96607D"/>
+        <a:srgbClr val="85DFD0"/>
       </a:folHlink>
     </a:clrScheme>
     <a:fontScheme name="Office">

</xml_diff>